<commit_message>
Add environnement help page in the user manual
Satisfy: I-0017-01-01-01 - Add environnement help page
</commit_message>
<xml_diff>
--- a/org.bpy.score.help/Doc/French/User_manual/Manuel utilisateur.docx
+++ b/org.bpy.score.help/Doc/French/User_manual/Manuel utilisateur.docx
@@ -2610,12 +2610,17 @@
     </w:p>
     <w:p>
       <w:r>
+        <w:t>Cet outil, dont vous ci-dessous une vue d’ensemble, est donc composés de vues, d’éditeurs et d’autres mécaniques qui vont être décrit dans les chapitres suivants.</w:t>
+      </w:r>
+    </w:p>
+    <w:p>
+      <w:r>
         <w:rPr>
           <w:noProof/>
           <w:lang w:eastAsia="fr-FR"/>
         </w:rPr>
         <w:drawing>
-          <wp:inline distT="0" distB="0" distL="0" distR="0" wp14:anchorId="6DC67535" wp14:editId="718B62CB">
+          <wp:inline distT="0" distB="0" distL="0" distR="0" wp14:anchorId="62CBF17B" wp14:editId="44FBEFE6">
             <wp:extent cx="5962650" cy="3257550"/>
             <wp:effectExtent l="0" t="0" r="0" b="0"/>
             <wp:docPr id="1" name="Image 1"/>
@@ -2665,11 +2670,6 @@
       </w:r>
     </w:p>
     <w:p>
-      <w:r>
-        <w:t>Cet outil est donc composés de vues, d’éditeurs et d’autres mécaniques qui vont être décrit dans les chapitres suivants.</w:t>
-      </w:r>
-    </w:p>
-    <w:p>
       <w:pPr>
         <w:pStyle w:val="Titre3"/>
       </w:pPr>
@@ -2802,7 +2802,7 @@
           <w:noProof/>
         </w:rPr>
         <w:drawing>
-          <wp:inline distT="0" distB="0" distL="0" distR="0" wp14:anchorId="0B59FF5C" wp14:editId="16A61868">
+          <wp:inline distT="0" distB="0" distL="0" distR="0" wp14:anchorId="102F19D5" wp14:editId="79FEBA98">
             <wp:extent cx="5972810" cy="1745615"/>
             <wp:effectExtent l="0" t="0" r="0" b="0"/>
             <wp:docPr id="1820760465" name="Image 1"/>
@@ -3003,7 +3003,7 @@
           <w:noProof/>
         </w:rPr>
         <w:drawing>
-          <wp:inline distT="0" distB="0" distL="0" distR="0" wp14:anchorId="7D031928" wp14:editId="7AE90964">
+          <wp:inline distT="0" distB="0" distL="0" distR="0" wp14:anchorId="3C495E97" wp14:editId="65BEACFB">
             <wp:extent cx="4587638" cy="1867062"/>
             <wp:effectExtent l="0" t="0" r="3810" b="0"/>
             <wp:docPr id="1943548890" name="Image 1"/>
@@ -3058,7 +3058,7 @@
           <w:noProof/>
         </w:rPr>
         <w:drawing>
-          <wp:inline distT="0" distB="0" distL="0" distR="0" wp14:anchorId="591A36E4" wp14:editId="5DB8A284">
+          <wp:inline distT="0" distB="0" distL="0" distR="0" wp14:anchorId="5EFF0920" wp14:editId="790DF8B2">
             <wp:extent cx="5121084" cy="853514"/>
             <wp:effectExtent l="0" t="0" r="3810" b="3810"/>
             <wp:docPr id="1315477746" name="Image 1"/>
@@ -3123,7 +3123,7 @@
           <w:noProof/>
         </w:rPr>
         <w:drawing>
-          <wp:inline distT="0" distB="0" distL="0" distR="0" wp14:anchorId="0F3F8C0E" wp14:editId="13ECB05B">
+          <wp:inline distT="0" distB="0" distL="0" distR="0" wp14:anchorId="280AD055" wp14:editId="41E71689">
             <wp:extent cx="5806943" cy="2568163"/>
             <wp:effectExtent l="0" t="0" r="3810" b="3810"/>
             <wp:docPr id="1892949598" name="Image 1"/>
@@ -3413,7 +3413,7 @@
           <w:noProof/>
         </w:rPr>
         <w:drawing>
-          <wp:inline distT="0" distB="0" distL="0" distR="0" wp14:anchorId="7A366088" wp14:editId="13223A92">
+          <wp:inline distT="0" distB="0" distL="0" distR="0" wp14:anchorId="59584E73" wp14:editId="2BC672F6">
             <wp:extent cx="5972810" cy="3279140"/>
             <wp:effectExtent l="0" t="0" r="0" b="0"/>
             <wp:docPr id="1481588894" name="Image 1"/>
@@ -3478,7 +3478,7 @@
           <w:noProof/>
         </w:rPr>
         <w:drawing>
-          <wp:inline distT="0" distB="0" distL="0" distR="0" wp14:anchorId="232D9B94" wp14:editId="27B63A82">
+          <wp:inline distT="0" distB="0" distL="0" distR="0" wp14:anchorId="77351165" wp14:editId="49E93B37">
             <wp:extent cx="5972810" cy="2374265"/>
             <wp:effectExtent l="0" t="0" r="0" b="0"/>
             <wp:docPr id="624141350" name="Image 1"/>
@@ -3782,7 +3782,7 @@
           <w:lang w:eastAsia="fr-FR"/>
         </w:rPr>
         <w:drawing>
-          <wp:inline distT="0" distB="0" distL="0" distR="0" wp14:anchorId="14EF5A7B" wp14:editId="3D6EDE93">
+          <wp:inline distT="0" distB="0" distL="0" distR="0" wp14:anchorId="139179A3" wp14:editId="4EF40EB9">
             <wp:extent cx="5972810" cy="2504440"/>
             <wp:effectExtent l="0" t="0" r="0" b="0"/>
             <wp:docPr id="442924048" name="Image 1"/>
@@ -3995,7 +3995,7 @@
           <w:lang w:eastAsia="fr-FR"/>
         </w:rPr>
         <w:drawing>
-          <wp:inline distT="0" distB="0" distL="0" distR="0" wp14:anchorId="615D8897" wp14:editId="5C4DE4DE">
+          <wp:inline distT="0" distB="0" distL="0" distR="0" wp14:anchorId="03E5A501" wp14:editId="1BF7CA04">
             <wp:extent cx="5972810" cy="2491740"/>
             <wp:effectExtent l="0" t="0" r="0" b="0"/>
             <wp:docPr id="947783554" name="Image 1"/>
@@ -4102,7 +4102,7 @@
           <w:lang w:eastAsia="fr-FR"/>
         </w:rPr>
         <w:drawing>
-          <wp:inline distT="0" distB="0" distL="0" distR="0" wp14:anchorId="3351F496" wp14:editId="6A20F375">
+          <wp:inline distT="0" distB="0" distL="0" distR="0" wp14:anchorId="0C0DCD34" wp14:editId="0885FDE4">
             <wp:extent cx="5972810" cy="3306445"/>
             <wp:effectExtent l="0" t="0" r="0" b="0"/>
             <wp:docPr id="135066668" name="Image 1"/>
@@ -10256,6 +10256,7 @@
   <w:style w:type="character" w:default="1" w:styleId="Policepardfaut">
     <w:name w:val="Default Paragraph Font"/>
     <w:uiPriority w:val="1"/>
+    <w:semiHidden/>
     <w:unhideWhenUsed/>
   </w:style>
   <w:style w:type="table" w:default="1" w:styleId="TableauNormal">

</xml_diff>